<commit_message>
fix(legal): supprime l'Article 8 (Transferts internationaux) de la Politique de Confidentialité
Retiré du .docx source (titre, 2 paragraphes, encart "Obligation légale
prioritaire") puis régénéré src/content/legal/confidentialite.ts (71 -> 67
blocs). Document passe directement de l'Article 7 à l'Article 9 : pas de
renumérotation des articles suivants, pour ne pas casser les 3 références
internes existantes vers l'Article 12 ni introduire un décalage non demandé.

La seule autre occurrence de "Article 8" dans le corpus légal ("Article 8
des CGU", Confidentialité 6.3) désigne l'Article 8 d'un document différent
et reste inchangée à raison. CDC vérifié : aucune mention des transferts
internationaux, pas de mise à jour nécessaire.

Vérifié dans le navigateur : la page /confidentialite affiche bien la
transition Article 7 -> Article 9, aucune trace de l'ancien Article 8.
tsc/eslint sans erreur.

Co-Authored-By: Claude Sonnet 5 <noreply@anthropic.com>
</commit_message>
<xml_diff>
--- a/docs/legal/Klarity_Politique_Confidentialite.docx
+++ b/docs/legal/Klarity_Politique_Confidentialite.docx
@@ -2959,115 +2959,6 @@
           <w:iCs w:val="false"/>
         </w:rPr>
         <w:t xml:space="preserve">Nous ne partageons vos données avec aucun autre tiers, sauf obligation légale, réquisition d'une autorité compétente, ou consentement exprès préalable de l'Utilisateur.</w:t>
-      </w:r>
-    </w:p>
-    <w:p>
-      <w:pPr>
-        <w:pStyle w:val="Heading1"/>
-        <w:spacing w:after="200" w:before="360"/>
-      </w:pPr>
-      <w:r>
-        <w:rPr>
-          <w:b/>
-          <w:bCs/>
-          <w:sz w:val="26"/>
-          <w:szCs w:val="26"/>
-        </w:rPr>
-        <w:t xml:space="preserve">ARTICLE 8 — TRANSFERTS INTERNATIONAUX DE DONNÉES</w:t>
-      </w:r>
-    </w:p>
-    <w:p>
-      <w:pPr>
-        <w:spacing w:after="160"/>
-      </w:pPr>
-      <w:r>
-        <w:rPr>
-          <w:b w:val="false"/>
-          <w:bCs w:val="false"/>
-          <w:i w:val="false"/>
-          <w:iCs w:val="false"/>
-        </w:rPr>
-        <w:t xml:space="preserve">Certains des prestataires mentionnés à l'Article 7 (notamment le fournisseur de l'API Anthropic Claude et, selon sa configuration technique, l'hébergement Cloudflare R2) sont susceptibles de traiter ou d'héberger des données en dehors du territoire camerounais.</w:t>
-      </w:r>
-    </w:p>
-    <w:tbl>
-      <w:tblPr>
-        <w:tblW w:type="pct" w:w="100%"/>
-        <w:tblBorders>
-          <w:top w:val="single" w:color="auto" w:sz="4"/>
-          <w:left w:val="single" w:color="auto" w:sz="4"/>
-          <w:bottom w:val="single" w:color="auto" w:sz="4"/>
-          <w:right w:val="single" w:color="auto" w:sz="4"/>
-          <w:insideH w:val="single" w:color="auto" w:sz="4"/>
-          <w:insideV w:val="single" w:color="auto" w:sz="4"/>
-        </w:tblBorders>
-      </w:tblPr>
-      <w:tblGrid>
-        <w:gridCol w:w="100"/>
-      </w:tblGrid>
-      <w:tr>
-        <w:tc>
-          <w:tcPr>
-            <w:shd w:fill="F2F2F2" w:color="auto" w:val="clear"/>
-            <w:tcMar>
-              <w:top w:type="dxa" w:w="150"/>
-              <w:left w:type="dxa" w:w="150"/>
-              <w:bottom w:type="dxa" w:w="150"/>
-              <w:right w:type="dxa" w:w="150"/>
-            </w:tcMar>
-          </w:tcPr>
-          <w:p>
-            <w:pPr>
-              <w:spacing w:after="0"/>
-            </w:pPr>
-            <w:r>
-              <w:rPr>
-                <w:b/>
-                <w:bCs/>
-                <w:i w:val="false"/>
-                <w:iCs w:val="false"/>
-              </w:rPr>
-              <w:t xml:space="preserve">Obligation légale prioritaire</w:t>
-            </w:r>
-            <w:r>
-              <w:rPr>
-                <w:b w:val="false"/>
-                <w:bCs w:val="false"/>
-                <w:i w:val="false"/>
-                <w:iCs w:val="false"/>
-              </w:rPr>
-              <w:t xml:space="preserve"> </w:t>
-            </w:r>
-            <w:r>
-              <w:rPr>
-                <w:b w:val="false"/>
-                <w:bCs w:val="false"/>
-                <w:i/>
-                <w:iCs/>
-              </w:rPr>
-              <w:t xml:space="preserve">L'article 19 de la Loi n°2024/017 soumet tout transfert de données à caractère personnel vers un pays étranger à une autorisation préalable de l'Autorité de Protection des Données à Caractère Personnel, qui vérifie que le pays de destination offre un niveau de protection équivalent à celui garanti par la Loi. Klarity s'engage à solliciter cette autorisation, prestataire par prestataire, avant toute collecte de données réelles d'Élèves au-delà d'un environnement de test, et à ne pas ouvrir commercialement les fonctionnalités concernées tant que cette autorisation n'est pas obtenue. Cette démarche conditionne la licéité du recours à l'intelligence artificielle tel que décrit à l'Article 6.</w:t>
-            </w:r>
-          </w:p>
-        </w:tc>
-      </w:tr>
-    </w:tbl>
-    <w:p>
-      <w:pPr>
-        <w:spacing w:after="160"/>
-      </w:pPr>
-    </w:p>
-    <w:p>
-      <w:pPr>
-        <w:spacing w:after="160"/>
-      </w:pPr>
-      <w:r>
-        <w:rPr>
-          <w:b w:val="false"/>
-          <w:bCs w:val="false"/>
-          <w:i w:val="false"/>
-          <w:iCs w:val="false"/>
-        </w:rPr>
-        <w:t xml:space="preserve">Lorsqu'un transfert est autorisé, Klarity s'assure de la mise en place de garanties appropriées (clauses contractuelles de protection des données, engagements de confidentialité et de sécurité) avec chaque prestataire concerné, documentées dans le registre des activités de traitement tenu par Klarity.</w:t>
       </w:r>
     </w:p>
     <w:p>

</xml_diff>